<commit_message>
fix(adam): correct CTCAE haemoglobin grading (unit bug -> no spurious Grade 4)
ADLB ATOXGR graded haemoglobin with g/L thresholds (100/80/65) against g/dL
values (~12.8), so every low HGB fell through to Grade 4. CTCAE v5 anaemia is
graded in g/dL (< LLN-10.0 / < 10.0-8.0 / < 8.0) and has no lab-based Grade 4.

Fix: HGB grades 0/1/2/3 at ANRLO / 10.0 / 8.0 g/dL. Grade 4 count 3,356 -> 0;
Grade>=3 lab records 3,644 -> 443 (NEUT 288, HGB 155 — genuinely severe). This
also removes the L-LB-01 rendering bottleneck: the full TFL suite now runs in
~1.4 min (was ~15). P21 unchanged (SDTM 10,981 / ADaM 10,931); T-LB-01/02 +
L-LB-01 refreshed.

Co-Authored-By: Claude Opus 4.8 (1M context) <noreply@anthropic.com>
Claude-Session: https://claude.ai/code/session_01X1XbsRpnoBmRduJv1Xfnxq
</commit_message>
<xml_diff>
--- a/tfl/tables/T-LB-02.docx
+++ b/tfl/tables/T-LB-02.docx
@@ -2694,7 +2694,7 @@
                 <w:szCs w:val="18"/>
                 <w:color w:val="000000"/>
               </w:rPr>
-              <w:t xml:space="preserve">224 (99.6)</w:t>
+              <w:t xml:space="preserve">68 (30.2)</w:t>
             </w:r>
           </w:p>
         </w:tc>
@@ -2749,7 +2749,7 @@
                 <w:szCs w:val="18"/>
                 <w:color w:val="000000"/>
               </w:rPr>
-              <w:t xml:space="preserve">223 (99.6)</w:t>
+              <w:t xml:space="preserve">70 (31.2)</w:t>
             </w:r>
           </w:p>
         </w:tc>
@@ -2864,7 +2864,7 @@
                 <w:szCs w:val="18"/>
                 <w:color w:val="000000"/>
               </w:rPr>
-              <w:t xml:space="preserve">224 (99.6)</w:t>
+              <w:t xml:space="preserve">0 (0.0)</w:t>
             </w:r>
           </w:p>
         </w:tc>
@@ -2919,7 +2919,7 @@
                 <w:szCs w:val="18"/>
                 <w:color w:val="000000"/>
               </w:rPr>
-              <w:t xml:space="preserve">223 (99.6)</w:t>
+              <w:t xml:space="preserve">0 (0.0)</w:t>
             </w:r>
           </w:p>
         </w:tc>

</xml_diff>